<commit_message>
1. Fast Fourier Transform Strided Algorithm naive from MachSuite, pipelined implementation attempt (not happy). 2. Stencil 9-point 2D Algorithm naive, pipelined and vectorized implementation (done). Without vitis.docx updated report.
</commit_message>
<xml_diff>
--- a/vitis.docx
+++ b/vitis.docx
@@ -1,6 +1,6 @@
 
 <file path=word/document.xml><?xml version="1.0" encoding="utf-8"?>
-<w:document xmlns:wpc="http://schemas.microsoft.com/office/word/2010/wordprocessingCanvas" xmlns:cx="http://schemas.microsoft.com/office/drawing/2014/chartex" xmlns:cx1="http://schemas.microsoft.com/office/drawing/2015/9/8/chartex" xmlns:cx2="http://schemas.microsoft.com/office/drawing/2015/10/21/chartex" xmlns:cx3="http://schemas.microsoft.com/office/drawing/2016/5/9/chartex" xmlns:cx4="http://schemas.microsoft.com/office/drawing/2016/5/10/chartex" xmlns:cx5="http://schemas.microsoft.com/office/drawing/2016/5/11/chartex" xmlns:cx6="http://schemas.microsoft.com/office/drawing/2016/5/12/chartex" xmlns:cx7="http://schemas.microsoft.com/office/drawing/2016/5/13/chartex" xmlns:cx8="http://schemas.microsoft.com/office/drawing/2016/5/14/chartex" xmlns:mc="http://schemas.openxmlformats.org/markup-compatibility/2006" xmlns:aink="http://schemas.microsoft.com/office/drawing/2016/ink" xmlns:am3d="http://schemas.microsoft.com/office/drawing/2017/model3d" xmlns:o="urn:schemas-microsoft-com:office:office" xmlns:oel="http://schemas.microsoft.com/office/2019/extlst" xmlns:r="http://schemas.openxmlformats.org/officeDocument/2006/relationships" xmlns:m="http://schemas.openxmlformats.org/officeDocument/2006/math" xmlns:v="urn:schemas-microsoft-com:vml" xmlns:wp14="http://schemas.microsoft.com/office/word/2010/wordprocessingDrawing" xmlns:wp="http://schemas.openxmlformats.org/drawingml/2006/wordprocessingDrawing" xmlns:w10="urn:schemas-microsoft-com:office:word" xmlns:w="http://schemas.openxmlformats.org/wordprocessingml/2006/main" xmlns:w14="http://schemas.microsoft.com/office/word/2010/wordml" xmlns:w15="http://schemas.microsoft.com/office/word/2012/wordml" xmlns:w16cex="http://schemas.microsoft.com/office/word/2018/wordml/cex" xmlns:w16cid="http://schemas.microsoft.com/office/word/2016/wordml/cid" xmlns:w16="http://schemas.microsoft.com/office/word/2018/wordml" xmlns:w16sdtdh="http://schemas.microsoft.com/office/word/2020/wordml/sdtdatahash" xmlns:w16se="http://schemas.microsoft.com/office/word/2015/wordml/symex" xmlns:wpg="http://schemas.microsoft.com/office/word/2010/wordprocessingGroup" xmlns:wpi="http://schemas.microsoft.com/office/word/2010/wordprocessingInk" xmlns:wne="http://schemas.microsoft.com/office/word/2006/wordml" xmlns:wps="http://schemas.microsoft.com/office/word/2010/wordprocessingShape" mc:Ignorable="w14 w15 w16se w16cid w16 w16cex w16sdtdh wp14">
+<w:document xmlns:wpc="http://schemas.microsoft.com/office/word/2010/wordprocessingCanvas" xmlns:cx="http://schemas.microsoft.com/office/drawing/2014/chartex" xmlns:cx1="http://schemas.microsoft.com/office/drawing/2015/9/8/chartex" xmlns:cx2="http://schemas.microsoft.com/office/drawing/2015/10/21/chartex" xmlns:cx3="http://schemas.microsoft.com/office/drawing/2016/5/9/chartex" xmlns:cx4="http://schemas.microsoft.com/office/drawing/2016/5/10/chartex" xmlns:cx5="http://schemas.microsoft.com/office/drawing/2016/5/11/chartex" xmlns:cx6="http://schemas.microsoft.com/office/drawing/2016/5/12/chartex" xmlns:cx7="http://schemas.microsoft.com/office/drawing/2016/5/13/chartex" xmlns:cx8="http://schemas.microsoft.com/office/drawing/2016/5/14/chartex" xmlns:mc="http://schemas.openxmlformats.org/markup-compatibility/2006" xmlns:aink="http://schemas.microsoft.com/office/drawing/2016/ink" xmlns:am3d="http://schemas.microsoft.com/office/drawing/2017/model3d" xmlns:o="urn:schemas-microsoft-com:office:office" xmlns:r="http://schemas.openxmlformats.org/officeDocument/2006/relationships" xmlns:m="http://schemas.openxmlformats.org/officeDocument/2006/math" xmlns:v="urn:schemas-microsoft-com:vml" xmlns:wp14="http://schemas.microsoft.com/office/word/2010/wordprocessingDrawing" xmlns:wp="http://schemas.openxmlformats.org/drawingml/2006/wordprocessingDrawing" xmlns:w10="urn:schemas-microsoft-com:office:word" xmlns:w="http://schemas.openxmlformats.org/wordprocessingml/2006/main" xmlns:w14="http://schemas.microsoft.com/office/word/2010/wordml" xmlns:w15="http://schemas.microsoft.com/office/word/2012/wordml" xmlns:w16cex="http://schemas.microsoft.com/office/word/2018/wordml/cex" xmlns:w16cid="http://schemas.microsoft.com/office/word/2016/wordml/cid" xmlns:w16="http://schemas.microsoft.com/office/word/2018/wordml" xmlns:w16sdtdh="http://schemas.microsoft.com/office/word/2020/wordml/sdtdatahash" xmlns:w16se="http://schemas.microsoft.com/office/word/2015/wordml/symex" xmlns:wpg="http://schemas.microsoft.com/office/word/2010/wordprocessingGroup" xmlns:wpi="http://schemas.microsoft.com/office/word/2010/wordprocessingInk" xmlns:wne="http://schemas.microsoft.com/office/word/2006/wordml" xmlns:wps="http://schemas.microsoft.com/office/word/2010/wordprocessingShape" mc:Ignorable="w14 w15 w16se w16cid w16 w16cex w16sdtdh wp14">
   <w:body>
     <w:p>
       <w:pPr>
@@ -4973,12 +4973,14 @@
       <w:r>
         <w:t>-</w:t>
       </w:r>
+      <w:proofErr w:type="spellStart"/>
       <w:r>
         <w:rPr>
           <w:lang w:val="en-US"/>
         </w:rPr>
         <w:t>inlining</w:t>
       </w:r>
+      <w:proofErr w:type="spellEnd"/>
       <w:r>
         <w:t xml:space="preserve"> αλλά διατήρησε ξεχωριστά </w:t>
       </w:r>
@@ -7801,7 +7803,21 @@
         <w:rPr>
           <w:lang w:val="en-US"/>
         </w:rPr>
-        <w:t>address → mux(16:1) → output</w:t>
+        <w:t xml:space="preserve">address → </w:t>
+      </w:r>
+      <w:proofErr w:type="gramStart"/>
+      <w:r>
+        <w:rPr>
+          <w:lang w:val="en-US"/>
+        </w:rPr>
+        <w:t>mux(</w:t>
+      </w:r>
+      <w:proofErr w:type="gramEnd"/>
+      <w:r>
+        <w:rPr>
+          <w:lang w:val="en-US"/>
+        </w:rPr>
+        <w:t>16:1) → output</w:t>
       </w:r>
     </w:p>
     <w:p>
@@ -8012,6 +8028,7 @@
         <w:rPr>
           <w:lang w:val="en-US"/>
         </w:rPr>
+        <w:lastRenderedPageBreak/>
         <w:t>Αιτί</w:t>
       </w:r>
       <w:proofErr w:type="spellEnd"/>
@@ -8600,17 +8617,17 @@
         <w:tblLook w:val="04A0" w:firstRow="1" w:lastRow="0" w:firstColumn="1" w:lastColumn="0" w:noHBand="0" w:noVBand="1"/>
       </w:tblPr>
       <w:tblGrid>
-        <w:gridCol w:w="2156"/>
-        <w:gridCol w:w="713"/>
-        <w:gridCol w:w="975"/>
-        <w:gridCol w:w="953"/>
-        <w:gridCol w:w="919"/>
-        <w:gridCol w:w="1088"/>
-        <w:gridCol w:w="775"/>
-        <w:gridCol w:w="612"/>
-        <w:gridCol w:w="679"/>
-        <w:gridCol w:w="794"/>
-        <w:gridCol w:w="792"/>
+        <w:gridCol w:w="2073"/>
+        <w:gridCol w:w="738"/>
+        <w:gridCol w:w="915"/>
+        <w:gridCol w:w="913"/>
+        <w:gridCol w:w="910"/>
+        <w:gridCol w:w="1047"/>
+        <w:gridCol w:w="815"/>
+        <w:gridCol w:w="662"/>
+        <w:gridCol w:w="734"/>
+        <w:gridCol w:w="818"/>
+        <w:gridCol w:w="831"/>
       </w:tblGrid>
       <w:tr>
         <w:tc>
@@ -9595,14 +9612,14 @@
         <w:tblLook w:val="04A0" w:firstRow="1" w:lastRow="0" w:firstColumn="1" w:lastColumn="0" w:noHBand="0" w:noVBand="1"/>
       </w:tblPr>
       <w:tblGrid>
-        <w:gridCol w:w="1304"/>
-        <w:gridCol w:w="1153"/>
-        <w:gridCol w:w="1225"/>
-        <w:gridCol w:w="1236"/>
-        <w:gridCol w:w="1271"/>
-        <w:gridCol w:w="1236"/>
-        <w:gridCol w:w="1780"/>
-        <w:gridCol w:w="1251"/>
+        <w:gridCol w:w="1298"/>
+        <w:gridCol w:w="1209"/>
+        <w:gridCol w:w="1246"/>
+        <w:gridCol w:w="1250"/>
+        <w:gridCol w:w="1272"/>
+        <w:gridCol w:w="1250"/>
+        <w:gridCol w:w="1673"/>
+        <w:gridCol w:w="1258"/>
       </w:tblGrid>
       <w:tr>
         <w:tc>
@@ -11213,20 +11230,20 @@
         <w:tblLook w:val="04A0" w:firstRow="1" w:lastRow="0" w:firstColumn="1" w:lastColumn="0" w:noHBand="0" w:noVBand="1"/>
       </w:tblPr>
       <w:tblGrid>
-        <w:gridCol w:w="954"/>
-        <w:gridCol w:w="839"/>
-        <w:gridCol w:w="922"/>
-        <w:gridCol w:w="788"/>
-        <w:gridCol w:w="772"/>
-        <w:gridCol w:w="803"/>
-        <w:gridCol w:w="746"/>
-        <w:gridCol w:w="652"/>
-        <w:gridCol w:w="873"/>
-        <w:gridCol w:w="638"/>
-        <w:gridCol w:w="515"/>
-        <w:gridCol w:w="652"/>
-        <w:gridCol w:w="652"/>
-        <w:gridCol w:w="650"/>
+        <w:gridCol w:w="970"/>
+        <w:gridCol w:w="846"/>
+        <w:gridCol w:w="923"/>
+        <w:gridCol w:w="757"/>
+        <w:gridCol w:w="755"/>
+        <w:gridCol w:w="819"/>
+        <w:gridCol w:w="752"/>
+        <w:gridCol w:w="639"/>
+        <w:gridCol w:w="870"/>
+        <w:gridCol w:w="653"/>
+        <w:gridCol w:w="492"/>
+        <w:gridCol w:w="655"/>
+        <w:gridCol w:w="655"/>
+        <w:gridCol w:w="670"/>
       </w:tblGrid>
       <w:tr>
         <w:tc>
@@ -12690,7 +12707,21 @@
         <w:rPr>
           <w:lang w:val="en-US"/>
         </w:rPr>
-        <w:t>INFO: Generating 'dadd_64ns'    : 8 instances  ← double addition</w:t>
+        <w:t xml:space="preserve">INFO: Generating 'dadd_64ns'  </w:t>
+      </w:r>
+      <w:proofErr w:type="gramStart"/>
+      <w:r>
+        <w:rPr>
+          <w:lang w:val="en-US"/>
+        </w:rPr>
+        <w:t xml:space="preserve">  :</w:t>
+      </w:r>
+      <w:proofErr w:type="gramEnd"/>
+      <w:r>
+        <w:rPr>
+          <w:lang w:val="en-US"/>
+        </w:rPr>
+        <w:t xml:space="preserve"> 8 instances  ← double addition</w:t>
       </w:r>
     </w:p>
     <w:p>
@@ -12703,7 +12734,21 @@
         <w:rPr>
           <w:lang w:val="en-US"/>
         </w:rPr>
-        <w:t>INFO: Generating 'dadddsub_64ns': 8 instances  ← double add/sub</w:t>
+        <w:t xml:space="preserve">INFO: Generating 'dadddsub_64ns': 8 </w:t>
+      </w:r>
+      <w:proofErr w:type="gramStart"/>
+      <w:r>
+        <w:rPr>
+          <w:lang w:val="en-US"/>
+        </w:rPr>
+        <w:t>instances  ←</w:t>
+      </w:r>
+      <w:proofErr w:type="gramEnd"/>
+      <w:r>
+        <w:rPr>
+          <w:lang w:val="en-US"/>
+        </w:rPr>
+        <w:t xml:space="preserve"> double add/sub</w:t>
       </w:r>
     </w:p>
     <w:p>
@@ -12716,7 +12761,21 @@
         <w:rPr>
           <w:lang w:val="en-US"/>
         </w:rPr>
-        <w:t>INFO: Generating 'ddiv_64ns'    : 2 instances  ← double division (!)</w:t>
+        <w:t xml:space="preserve">INFO: Generating 'ddiv_64ns'  </w:t>
+      </w:r>
+      <w:proofErr w:type="gramStart"/>
+      <w:r>
+        <w:rPr>
+          <w:lang w:val="en-US"/>
+        </w:rPr>
+        <w:t xml:space="preserve">  :</w:t>
+      </w:r>
+      <w:proofErr w:type="gramEnd"/>
+      <w:r>
+        <w:rPr>
+          <w:lang w:val="en-US"/>
+        </w:rPr>
+        <w:t xml:space="preserve"> 2 instances  ← double division (!)</w:t>
       </w:r>
     </w:p>
     <w:p>
@@ -12729,7 +12788,21 @@
         <w:rPr>
           <w:lang w:val="en-US"/>
         </w:rPr>
-        <w:t>INFO: Generating 'dmul_64ns'    : 20 instances ← double multiply</w:t>
+        <w:t xml:space="preserve">INFO: Generating 'dmul_64ns'  </w:t>
+      </w:r>
+      <w:proofErr w:type="gramStart"/>
+      <w:r>
+        <w:rPr>
+          <w:lang w:val="en-US"/>
+        </w:rPr>
+        <w:t xml:space="preserve">  :</w:t>
+      </w:r>
+      <w:proofErr w:type="gramEnd"/>
+      <w:r>
+        <w:rPr>
+          <w:lang w:val="en-US"/>
+        </w:rPr>
+        <w:t xml:space="preserve"> 20 instances ← double multiply</w:t>
       </w:r>
     </w:p>
     <w:p>
@@ -13924,7 +13997,11 @@
       </w:r>
       <w:proofErr w:type="spellEnd"/>
       <w:r>
-        <w:t>=21×16×256=86,016</w:t>
+        <w:t>=21×16×256=</w:t>
+      </w:r>
+      <w:proofErr w:type="gramStart"/>
+      <w:r>
+        <w:t>86,016</w:t>
       </w:r>
       <w:r>
         <w:rPr>
@@ -13945,6 +14022,7 @@
         </w:rPr>
         <w:t>FLOP</w:t>
       </w:r>
+      <w:proofErr w:type="gramEnd"/>
     </w:p>
     <w:p>
       <w:r>
@@ -13976,11 +14054,6 @@
       </w:r>
     </w:p>
     <w:p>
-      <w:pPr>
-        <w:rPr>
-          <w:lang w:val="en-US"/>
-        </w:rPr>
-      </w:pPr>
       <w:r>
         <w:rPr>
           <w:lang w:val="en-US"/>
@@ -13988,21 +14061,12 @@
         <w:t>GFLOPS</w:t>
       </w:r>
       <w:r>
-        <w:rPr>
-          <w:lang w:val="en-US"/>
-        </w:rPr>
         <w:t xml:space="preserve"> </w:t>
       </w:r>
       <w:r>
-        <w:rPr>
-          <w:lang w:val="en-US"/>
-        </w:rPr>
         <w:t>=</w:t>
       </w:r>
       <w:r>
-        <w:rPr>
-          <w:lang w:val="en-US"/>
-        </w:rPr>
         <w:t xml:space="preserve"> </w:t>
       </w:r>
       <w:proofErr w:type="spellStart"/>
@@ -14014,21 +14078,12 @@
       </w:r>
       <w:proofErr w:type="spellEnd"/>
       <w:r>
-        <w:rPr>
-          <w:lang w:val="en-US"/>
-        </w:rPr>
         <w:t xml:space="preserve"> </w:t>
       </w:r>
       <w:r>
-        <w:rPr>
-          <w:lang w:val="en-US"/>
-        </w:rPr>
         <w:t>×</w:t>
       </w:r>
       <w:r>
-        <w:rPr>
-          <w:lang w:val="en-US"/>
-        </w:rPr>
         <w:t xml:space="preserve"> </w:t>
       </w:r>
       <w:proofErr w:type="spellStart"/>
@@ -14040,9 +14095,6 @@
       </w:r>
       <w:proofErr w:type="spellEnd"/>
       <w:r>
-        <w:rPr>
-          <w:lang w:val="en-US"/>
-        </w:rPr>
         <w:t xml:space="preserve"> / </w:t>
       </w:r>
       <w:proofErr w:type="spellStart"/>
@@ -14286,17 +14338,7 @@
           <w:szCs w:val="28"/>
           <w:lang w:val="en-US"/>
         </w:rPr>
-        <w:t xml:space="preserve"> </w:t>
-      </w:r>
-      <w:r>
-        <w:rPr>
-          <w:b/>
-          <w:bCs/>
-          <w:sz w:val="28"/>
-          <w:szCs w:val="28"/>
-          <w:lang w:val="en-US"/>
-        </w:rPr>
-        <w:t xml:space="preserve">Pipelined </w:t>
+        <w:t xml:space="preserve"> Pipelined </w:t>
       </w:r>
       <w:r>
         <w:rPr>
@@ -15202,14 +15244,7 @@
           <w:vertAlign w:val="subscript"/>
           <w:lang w:val="en-US"/>
         </w:rPr>
-        <w:t>@</w:t>
-      </w:r>
-      <w:r>
-        <w:rPr>
-          <w:vertAlign w:val="subscript"/>
-          <w:lang w:val="en-US"/>
-        </w:rPr>
-        <w:t>100</w:t>
+        <w:t>@100</w:t>
       </w:r>
       <w:r>
         <w:rPr>
@@ -15249,14 +15284,7 @@
           <w:vertAlign w:val="subscript"/>
           <w:lang w:val="en-US"/>
         </w:rPr>
-        <w:t>@</w:t>
-      </w:r>
-      <w:r>
-        <w:rPr>
-          <w:vertAlign w:val="subscript"/>
-          <w:lang w:val="en-US"/>
-        </w:rPr>
-        <w:t>fmax</w:t>
+        <w:t>@fmax</w:t>
       </w:r>
       <w:proofErr w:type="spellEnd"/>
       <w:r>
@@ -16316,12 +16344,14 @@
       <w:r>
         <w:t>/</w:t>
       </w:r>
+      <w:proofErr w:type="spellStart"/>
       <w:r>
         <w:rPr>
           <w:lang w:val="en-US"/>
         </w:rPr>
         <w:t>fz</w:t>
       </w:r>
+      <w:proofErr w:type="spellEnd"/>
       <w:r>
         <w:t xml:space="preserve">. </w:t>
       </w:r>
@@ -16910,7 +16940,21 @@
         <w:rPr>
           <w:lang w:val="en-US"/>
         </w:rPr>
-        <w:t>dadd_64ns  : 27 instances (vs 8+8 naive)  ← double addition</w:t>
+        <w:t>dadd_64</w:t>
+      </w:r>
+      <w:proofErr w:type="gramStart"/>
+      <w:r>
+        <w:rPr>
+          <w:lang w:val="en-US"/>
+        </w:rPr>
+        <w:t>ns  :</w:t>
+      </w:r>
+      <w:proofErr w:type="gramEnd"/>
+      <w:r>
+        <w:rPr>
+          <w:lang w:val="en-US"/>
+        </w:rPr>
+        <w:t xml:space="preserve"> 27 instances (vs 8+8 naive)  ← double addition</w:t>
       </w:r>
     </w:p>
     <w:p>
@@ -16923,7 +16967,21 @@
         <w:rPr>
           <w:lang w:val="en-US"/>
         </w:rPr>
-        <w:t xml:space="preserve">  ddiv_64ns  :  1 instance  (vs 2 naive)    ← double division</w:t>
+        <w:t xml:space="preserve">  ddiv_64</w:t>
+      </w:r>
+      <w:proofErr w:type="gramStart"/>
+      <w:r>
+        <w:rPr>
+          <w:lang w:val="en-US"/>
+        </w:rPr>
+        <w:t>ns  :</w:t>
+      </w:r>
+      <w:proofErr w:type="gramEnd"/>
+      <w:r>
+        <w:rPr>
+          <w:lang w:val="en-US"/>
+        </w:rPr>
+        <w:t xml:space="preserve">  1 instance  (vs 2 naive)    ← double division</w:t>
       </w:r>
     </w:p>
     <w:p>
@@ -16936,7 +16994,21 @@
         <w:rPr>
           <w:lang w:val="en-US"/>
         </w:rPr>
-        <w:t xml:space="preserve">  dmul_64ns  : 11 instances (vs 20 naive)   ← double multiply</w:t>
+        <w:t xml:space="preserve">  dmul_64</w:t>
+      </w:r>
+      <w:proofErr w:type="gramStart"/>
+      <w:r>
+        <w:rPr>
+          <w:lang w:val="en-US"/>
+        </w:rPr>
+        <w:t>ns  :</w:t>
+      </w:r>
+      <w:proofErr w:type="gramEnd"/>
+      <w:r>
+        <w:rPr>
+          <w:lang w:val="en-US"/>
+        </w:rPr>
+        <w:t xml:space="preserve"> 11 instances (vs 20 naive)   ← double multiply</w:t>
       </w:r>
     </w:p>
     <w:p>
@@ -16949,7 +17021,21 @@
         <w:rPr>
           <w:lang w:val="en-US"/>
         </w:rPr>
-        <w:t xml:space="preserve">  dsub_64ns  :  3 instances (vs 0 naive)    ← double subtraction</w:t>
+        <w:t xml:space="preserve">  dsub_64</w:t>
+      </w:r>
+      <w:proofErr w:type="gramStart"/>
+      <w:r>
+        <w:rPr>
+          <w:lang w:val="en-US"/>
+        </w:rPr>
+        <w:t>ns  :</w:t>
+      </w:r>
+      <w:proofErr w:type="gramEnd"/>
+      <w:r>
+        <w:rPr>
+          <w:lang w:val="en-US"/>
+        </w:rPr>
+        <w:t xml:space="preserve">  3 instances (vs 0 naive)    ← double subtraction</w:t>
       </w:r>
     </w:p>
     <w:p>
@@ -17524,7 +17610,1308 @@
     </w:p>
     <w:p>
       <w:pPr>
-        <w:rPr>
+        <w:jc w:val="center"/>
+        <w:rPr>
+          <w:b/>
+          <w:bCs/>
+          <w:sz w:val="36"/>
+          <w:szCs w:val="36"/>
+          <w:lang w:val="en-US"/>
+        </w:rPr>
+      </w:pPr>
+      <w:r>
+        <w:rPr>
+          <w:b/>
+          <w:bCs/>
+          <w:sz w:val="36"/>
+          <w:szCs w:val="36"/>
+          <w:lang w:val="en-US"/>
+        </w:rPr>
+        <w:lastRenderedPageBreak/>
+        <w:t xml:space="preserve">Fast Fourier Transform </w:t>
+      </w:r>
+      <w:proofErr w:type="spellStart"/>
+      <w:r>
+        <w:rPr>
+          <w:b/>
+          <w:bCs/>
+          <w:sz w:val="36"/>
+          <w:szCs w:val="36"/>
+          <w:lang w:val="en-US"/>
+        </w:rPr>
+        <w:t>Strided</w:t>
+      </w:r>
+      <w:proofErr w:type="spellEnd"/>
+    </w:p>
+    <w:p>
+      <w:pPr>
+        <w:rPr>
+          <w:b/>
+          <w:bCs/>
+          <w:sz w:val="28"/>
+          <w:szCs w:val="28"/>
+          <w:lang w:val="en-US"/>
+        </w:rPr>
+      </w:pPr>
+      <w:r>
+        <w:rPr>
+          <w:b/>
+          <w:bCs/>
+          <w:sz w:val="28"/>
+          <w:szCs w:val="28"/>
+          <w:lang w:val="en-US"/>
+        </w:rPr>
+        <w:t xml:space="preserve">FFT Naïve </w:t>
+      </w:r>
+      <w:r>
+        <w:rPr>
+          <w:b/>
+          <w:bCs/>
+          <w:sz w:val="28"/>
+          <w:szCs w:val="28"/>
+        </w:rPr>
+        <w:t>Αποτελέσματα</w:t>
+      </w:r>
+    </w:p>
+    <w:p>
+      <w:pPr>
+        <w:rPr>
+          <w:szCs w:val="20"/>
+          <w:lang w:val="en-US"/>
+        </w:rPr>
+      </w:pPr>
+      <w:r>
+        <w:rPr>
+          <w:szCs w:val="20"/>
+          <w:lang w:val="en-US"/>
+        </w:rPr>
+        <w:t>Estimated Fmax: 141.08 MHz</w:t>
+      </w:r>
+    </w:p>
+    <w:tbl>
+      <w:tblPr>
+        <w:tblStyle w:val="aa"/>
+        <w:tblW w:w="0" w:type="auto"/>
+        <w:tblLook w:val="04A0" w:firstRow="1" w:lastRow="0" w:firstColumn="1" w:lastColumn="0" w:noHBand="0" w:noVBand="1"/>
+      </w:tblPr>
+      <w:tblGrid>
+        <w:gridCol w:w="1637"/>
+        <w:gridCol w:w="1335"/>
+        <w:gridCol w:w="908"/>
+        <w:gridCol w:w="937"/>
+        <w:gridCol w:w="903"/>
+        <w:gridCol w:w="1047"/>
+        <w:gridCol w:w="791"/>
+        <w:gridCol w:w="610"/>
+        <w:gridCol w:w="695"/>
+        <w:gridCol w:w="784"/>
+        <w:gridCol w:w="809"/>
+      </w:tblGrid>
+      <w:tr>
+        <w:tc>
+          <w:tcPr>
+            <w:tcW w:w="1637" w:type="dxa"/>
+          </w:tcPr>
+          <w:p>
+            <w:pPr>
+              <w:rPr>
+                <w:lang w:val="en-US"/>
+              </w:rPr>
+            </w:pPr>
+            <w:r>
+              <w:rPr>
+                <w:lang w:val="en-US"/>
+              </w:rPr>
+              <w:t>Module / Loop</w:t>
+            </w:r>
+          </w:p>
+        </w:tc>
+        <w:tc>
+          <w:tcPr>
+            <w:tcW w:w="1335" w:type="dxa"/>
+          </w:tcPr>
+          <w:p>
+            <w:pPr>
+              <w:rPr>
+                <w:lang w:val="en-US"/>
+              </w:rPr>
+            </w:pPr>
+            <w:r>
+              <w:rPr>
+                <w:lang w:val="en-US"/>
+              </w:rPr>
+              <w:t>Issue Type</w:t>
+            </w:r>
+          </w:p>
+        </w:tc>
+        <w:tc>
+          <w:tcPr>
+            <w:tcW w:w="908" w:type="dxa"/>
+          </w:tcPr>
+          <w:p>
+            <w:pPr>
+              <w:rPr>
+                <w:lang w:val="en-US"/>
+              </w:rPr>
+            </w:pPr>
+            <w:r>
+              <w:rPr>
+                <w:lang w:val="en-US"/>
+              </w:rPr>
+              <w:t>Latency (Cycles)</w:t>
+            </w:r>
+          </w:p>
+        </w:tc>
+        <w:tc>
+          <w:tcPr>
+            <w:tcW w:w="937" w:type="dxa"/>
+          </w:tcPr>
+          <w:p>
+            <w:pPr>
+              <w:rPr>
+                <w:lang w:val="en-US"/>
+              </w:rPr>
+            </w:pPr>
+            <w:r>
+              <w:rPr>
+                <w:lang w:val="en-US"/>
+              </w:rPr>
+              <w:t>Latency (ns)</w:t>
+            </w:r>
+          </w:p>
+        </w:tc>
+        <w:tc>
+          <w:tcPr>
+            <w:tcW w:w="903" w:type="dxa"/>
+          </w:tcPr>
+          <w:p>
+            <w:pPr>
+              <w:rPr>
+                <w:lang w:val="en-US"/>
+              </w:rPr>
+            </w:pPr>
+            <w:r>
+              <w:rPr>
+                <w:lang w:val="en-US"/>
+              </w:rPr>
+              <w:t>Interval</w:t>
+            </w:r>
+          </w:p>
+        </w:tc>
+        <w:tc>
+          <w:tcPr>
+            <w:tcW w:w="1047" w:type="dxa"/>
+          </w:tcPr>
+          <w:p>
+            <w:pPr>
+              <w:rPr>
+                <w:lang w:val="en-US"/>
+              </w:rPr>
+            </w:pPr>
+            <w:r>
+              <w:rPr>
+                <w:lang w:val="en-US"/>
+              </w:rPr>
+              <w:t>Pipelined</w:t>
+            </w:r>
+          </w:p>
+        </w:tc>
+        <w:tc>
+          <w:tcPr>
+            <w:tcW w:w="791" w:type="dxa"/>
+          </w:tcPr>
+          <w:p>
+            <w:pPr>
+              <w:rPr>
+                <w:lang w:val="en-US"/>
+              </w:rPr>
+            </w:pPr>
+            <w:r>
+              <w:rPr>
+                <w:lang w:val="en-US"/>
+              </w:rPr>
+              <w:t>BRAM</w:t>
+            </w:r>
+          </w:p>
+        </w:tc>
+        <w:tc>
+          <w:tcPr>
+            <w:tcW w:w="610" w:type="dxa"/>
+          </w:tcPr>
+          <w:p>
+            <w:pPr>
+              <w:rPr>
+                <w:lang w:val="en-US"/>
+              </w:rPr>
+            </w:pPr>
+            <w:r>
+              <w:rPr>
+                <w:lang w:val="en-US"/>
+              </w:rPr>
+              <w:t>DSP</w:t>
+            </w:r>
+          </w:p>
+        </w:tc>
+        <w:tc>
+          <w:tcPr>
+            <w:tcW w:w="695" w:type="dxa"/>
+          </w:tcPr>
+          <w:p>
+            <w:pPr>
+              <w:rPr>
+                <w:lang w:val="en-US"/>
+              </w:rPr>
+            </w:pPr>
+            <w:r>
+              <w:rPr>
+                <w:lang w:val="en-US"/>
+              </w:rPr>
+              <w:t>FF</w:t>
+            </w:r>
+          </w:p>
+        </w:tc>
+        <w:tc>
+          <w:tcPr>
+            <w:tcW w:w="784" w:type="dxa"/>
+          </w:tcPr>
+          <w:p>
+            <w:pPr>
+              <w:rPr>
+                <w:lang w:val="en-US"/>
+              </w:rPr>
+            </w:pPr>
+            <w:r>
+              <w:rPr>
+                <w:lang w:val="en-US"/>
+              </w:rPr>
+              <w:t>LUT</w:t>
+            </w:r>
+          </w:p>
+        </w:tc>
+        <w:tc>
+          <w:tcPr>
+            <w:tcW w:w="809" w:type="dxa"/>
+          </w:tcPr>
+          <w:p>
+            <w:pPr>
+              <w:rPr>
+                <w:lang w:val="en-US"/>
+              </w:rPr>
+            </w:pPr>
+            <w:r>
+              <w:rPr>
+                <w:lang w:val="en-US"/>
+              </w:rPr>
+              <w:t>URAM</w:t>
+            </w:r>
+          </w:p>
+        </w:tc>
+      </w:tr>
+      <w:tr>
+        <w:tc>
+          <w:tcPr>
+            <w:tcW w:w="1637" w:type="dxa"/>
+          </w:tcPr>
+          <w:p>
+            <w:pPr>
+              <w:rPr>
+                <w:lang w:val="en-US"/>
+              </w:rPr>
+            </w:pPr>
+            <w:proofErr w:type="spellStart"/>
+            <w:r>
+              <w:rPr>
+                <w:lang w:val="en-US"/>
+              </w:rPr>
+              <w:t>fft</w:t>
+            </w:r>
+            <w:proofErr w:type="spellEnd"/>
+          </w:p>
+        </w:tc>
+        <w:tc>
+          <w:tcPr>
+            <w:tcW w:w="1335" w:type="dxa"/>
+          </w:tcPr>
+          <w:p>
+            <w:pPr>
+              <w:rPr>
+                <w:lang w:val="en-US"/>
+              </w:rPr>
+            </w:pPr>
+            <w:r>
+              <w:rPr>
+                <w:lang w:val="en-US"/>
+              </w:rPr>
+              <w:t>—</w:t>
+            </w:r>
+          </w:p>
+        </w:tc>
+        <w:tc>
+          <w:tcPr>
+            <w:tcW w:w="908" w:type="dxa"/>
+          </w:tcPr>
+          <w:p>
+            <w:pPr>
+              <w:rPr>
+                <w:lang w:val="en-US"/>
+              </w:rPr>
+            </w:pPr>
+            <w:r>
+              <w:rPr>
+                <w:lang w:val="en-US"/>
+              </w:rPr>
+              <w:t>163881</w:t>
+            </w:r>
+          </w:p>
+        </w:tc>
+        <w:tc>
+          <w:tcPr>
+            <w:tcW w:w="937" w:type="dxa"/>
+          </w:tcPr>
+          <w:p>
+            <w:pPr>
+              <w:rPr>
+                <w:lang w:val="en-US"/>
+              </w:rPr>
+            </w:pPr>
+            <w:r>
+              <w:rPr>
+                <w:lang w:val="en-US"/>
+              </w:rPr>
+              <w:t>1.639E6</w:t>
+            </w:r>
+          </w:p>
+        </w:tc>
+        <w:tc>
+          <w:tcPr>
+            <w:tcW w:w="903" w:type="dxa"/>
+          </w:tcPr>
+          <w:p>
+            <w:pPr>
+              <w:rPr>
+                <w:lang w:val="en-US"/>
+              </w:rPr>
+            </w:pPr>
+            <w:r>
+              <w:rPr>
+                <w:lang w:val="en-US"/>
+              </w:rPr>
+              <w:t>16388</w:t>
+            </w:r>
+            <w:r>
+              <w:rPr>
+                <w:lang w:val="en-US"/>
+              </w:rPr>
+              <w:t>2</w:t>
+            </w:r>
+          </w:p>
+        </w:tc>
+        <w:tc>
+          <w:tcPr>
+            <w:tcW w:w="1047" w:type="dxa"/>
+          </w:tcPr>
+          <w:p>
+            <w:pPr>
+              <w:rPr>
+                <w:lang w:val="en-US"/>
+              </w:rPr>
+            </w:pPr>
+            <w:r>
+              <w:rPr>
+                <w:lang w:val="en-US"/>
+              </w:rPr>
+              <w:t>no</w:t>
+            </w:r>
+          </w:p>
+        </w:tc>
+        <w:tc>
+          <w:tcPr>
+            <w:tcW w:w="791" w:type="dxa"/>
+          </w:tcPr>
+          <w:p>
+            <w:pPr>
+              <w:rPr>
+                <w:lang w:val="en-US"/>
+              </w:rPr>
+            </w:pPr>
+            <w:r>
+              <w:rPr>
+                <w:lang w:val="en-US"/>
+              </w:rPr>
+              <w:t>0</w:t>
+            </w:r>
+          </w:p>
+        </w:tc>
+        <w:tc>
+          <w:tcPr>
+            <w:tcW w:w="610" w:type="dxa"/>
+          </w:tcPr>
+          <w:p>
+            <w:pPr>
+              <w:rPr>
+                <w:lang w:val="en-US"/>
+              </w:rPr>
+            </w:pPr>
+            <w:r>
+              <w:rPr>
+                <w:lang w:val="en-US"/>
+              </w:rPr>
+              <w:t>38</w:t>
+            </w:r>
+          </w:p>
+        </w:tc>
+        <w:tc>
+          <w:tcPr>
+            <w:tcW w:w="695" w:type="dxa"/>
+          </w:tcPr>
+          <w:p>
+            <w:pPr>
+              <w:rPr>
+                <w:lang w:val="en-US"/>
+              </w:rPr>
+            </w:pPr>
+            <w:r>
+              <w:rPr>
+                <w:lang w:val="en-US"/>
+              </w:rPr>
+              <w:t>2914</w:t>
+            </w:r>
+          </w:p>
+        </w:tc>
+        <w:tc>
+          <w:tcPr>
+            <w:tcW w:w="784" w:type="dxa"/>
+          </w:tcPr>
+          <w:p>
+            <w:pPr>
+              <w:rPr>
+                <w:lang w:val="en-US"/>
+              </w:rPr>
+            </w:pPr>
+            <w:r>
+              <w:rPr>
+                <w:lang w:val="en-US"/>
+              </w:rPr>
+              <w:t>2347</w:t>
+            </w:r>
+          </w:p>
+        </w:tc>
+        <w:tc>
+          <w:tcPr>
+            <w:tcW w:w="809" w:type="dxa"/>
+          </w:tcPr>
+          <w:p>
+            <w:pPr>
+              <w:rPr>
+                <w:lang w:val="en-US"/>
+              </w:rPr>
+            </w:pPr>
+            <w:r>
+              <w:rPr>
+                <w:lang w:val="en-US"/>
+              </w:rPr>
+              <w:t>0</w:t>
+            </w:r>
+          </w:p>
+        </w:tc>
+      </w:tr>
+      <w:tr>
+        <w:tc>
+          <w:tcPr>
+            <w:tcW w:w="1637" w:type="dxa"/>
+          </w:tcPr>
+          <w:p>
+            <w:pPr>
+              <w:rPr>
+                <w:lang w:val="en-US"/>
+              </w:rPr>
+            </w:pPr>
+            <w:r>
+              <w:rPr>
+                <w:lang w:val="en-US"/>
+              </w:rPr>
+              <w:t>outer (1)</w:t>
+            </w:r>
+          </w:p>
+        </w:tc>
+        <w:tc>
+          <w:tcPr>
+            <w:tcW w:w="1335" w:type="dxa"/>
+          </w:tcPr>
+          <w:p>
+            <w:pPr>
+              <w:rPr>
+                <w:lang w:val="en-US"/>
+              </w:rPr>
+            </w:pPr>
+            <w:r>
+              <w:rPr>
+                <w:lang w:val="en-US"/>
+              </w:rPr>
+              <w:t>—</w:t>
+            </w:r>
+          </w:p>
+        </w:tc>
+        <w:tc>
+          <w:tcPr>
+            <w:tcW w:w="908" w:type="dxa"/>
+          </w:tcPr>
+          <w:p>
+            <w:pPr>
+              <w:rPr>
+                <w:lang w:val="en-US"/>
+              </w:rPr>
+            </w:pPr>
+            <w:r>
+              <w:rPr>
+                <w:lang w:val="en-US"/>
+              </w:rPr>
+              <w:t>16388</w:t>
+            </w:r>
+            <w:r>
+              <w:rPr>
+                <w:lang w:val="en-US"/>
+              </w:rPr>
+              <w:t>0</w:t>
+            </w:r>
+          </w:p>
+        </w:tc>
+        <w:tc>
+          <w:tcPr>
+            <w:tcW w:w="937" w:type="dxa"/>
+          </w:tcPr>
+          <w:p>
+            <w:pPr>
+              <w:rPr>
+                <w:lang w:val="en-US"/>
+              </w:rPr>
+            </w:pPr>
+            <w:r>
+              <w:rPr>
+                <w:lang w:val="en-US"/>
+              </w:rPr>
+              <w:t>1.639E6</w:t>
+            </w:r>
+          </w:p>
+        </w:tc>
+        <w:tc>
+          <w:tcPr>
+            <w:tcW w:w="903" w:type="dxa"/>
+          </w:tcPr>
+          <w:p>
+            <w:pPr>
+              <w:rPr>
+                <w:lang w:val="en-US"/>
+              </w:rPr>
+            </w:pPr>
+            <w:r>
+              <w:rPr>
+                <w:lang w:val="en-US"/>
+              </w:rPr>
+              <w:t>-</w:t>
+            </w:r>
+          </w:p>
+        </w:tc>
+        <w:tc>
+          <w:tcPr>
+            <w:tcW w:w="1047" w:type="dxa"/>
+          </w:tcPr>
+          <w:p>
+            <w:pPr>
+              <w:rPr>
+                <w:lang w:val="en-US"/>
+              </w:rPr>
+            </w:pPr>
+            <w:r>
+              <w:rPr>
+                <w:lang w:val="en-US"/>
+              </w:rPr>
+              <w:t>no</w:t>
+            </w:r>
+          </w:p>
+        </w:tc>
+        <w:tc>
+          <w:tcPr>
+            <w:tcW w:w="791" w:type="dxa"/>
+          </w:tcPr>
+          <w:p>
+            <w:pPr>
+              <w:rPr>
+                <w:lang w:val="en-US"/>
+              </w:rPr>
+            </w:pPr>
+            <w:r>
+              <w:rPr>
+                <w:lang w:val="en-US"/>
+              </w:rPr>
+              <w:t>-</w:t>
+            </w:r>
+          </w:p>
+        </w:tc>
+        <w:tc>
+          <w:tcPr>
+            <w:tcW w:w="610" w:type="dxa"/>
+          </w:tcPr>
+          <w:p>
+            <w:pPr>
+              <w:rPr>
+                <w:lang w:val="en-US"/>
+              </w:rPr>
+            </w:pPr>
+            <w:r>
+              <w:rPr>
+                <w:lang w:val="en-US"/>
+              </w:rPr>
+              <w:t>-</w:t>
+            </w:r>
+          </w:p>
+        </w:tc>
+        <w:tc>
+          <w:tcPr>
+            <w:tcW w:w="695" w:type="dxa"/>
+          </w:tcPr>
+          <w:p>
+            <w:pPr>
+              <w:rPr>
+                <w:lang w:val="en-US"/>
+              </w:rPr>
+            </w:pPr>
+            <w:r>
+              <w:rPr>
+                <w:lang w:val="en-US"/>
+              </w:rPr>
+              <w:t>-</w:t>
+            </w:r>
+          </w:p>
+        </w:tc>
+        <w:tc>
+          <w:tcPr>
+            <w:tcW w:w="784" w:type="dxa"/>
+          </w:tcPr>
+          <w:p>
+            <w:pPr>
+              <w:rPr>
+                <w:lang w:val="en-US"/>
+              </w:rPr>
+            </w:pPr>
+            <w:r>
+              <w:rPr>
+                <w:lang w:val="en-US"/>
+              </w:rPr>
+              <w:t>-</w:t>
+            </w:r>
+          </w:p>
+        </w:tc>
+        <w:tc>
+          <w:tcPr>
+            <w:tcW w:w="809" w:type="dxa"/>
+          </w:tcPr>
+          <w:p>
+            <w:pPr>
+              <w:rPr>
+                <w:lang w:val="en-US"/>
+              </w:rPr>
+            </w:pPr>
+            <w:r>
+              <w:rPr>
+                <w:lang w:val="en-US"/>
+              </w:rPr>
+              <w:t>-</w:t>
+            </w:r>
+          </w:p>
+        </w:tc>
+      </w:tr>
+      <w:tr>
+        <w:tc>
+          <w:tcPr>
+            <w:tcW w:w="1637" w:type="dxa"/>
+          </w:tcPr>
+          <w:p>
+            <w:pPr>
+              <w:rPr>
+                <w:lang w:val="en-US"/>
+              </w:rPr>
+            </w:pPr>
+            <w:proofErr w:type="spellStart"/>
+            <w:r>
+              <w:rPr>
+                <w:lang w:val="en-US"/>
+              </w:rPr>
+              <w:t>Fft_Pipeline</w:t>
+            </w:r>
+            <w:proofErr w:type="spellEnd"/>
+            <w:r>
+              <w:rPr>
+                <w:lang w:val="en-US"/>
+              </w:rPr>
+              <w:t xml:space="preserve"> _inner (1)</w:t>
+            </w:r>
+          </w:p>
+        </w:tc>
+        <w:tc>
+          <w:tcPr>
+            <w:tcW w:w="1335" w:type="dxa"/>
+          </w:tcPr>
+          <w:p>
+            <w:pPr>
+              <w:rPr>
+                <w:lang w:val="en-US"/>
+              </w:rPr>
+            </w:pPr>
+            <w:r>
+              <w:rPr>
+                <w:lang w:val="en-US"/>
+              </w:rPr>
+              <w:t>—</w:t>
+            </w:r>
+          </w:p>
+        </w:tc>
+        <w:tc>
+          <w:tcPr>
+            <w:tcW w:w="908" w:type="dxa"/>
+          </w:tcPr>
+          <w:p>
+            <w:pPr>
+              <w:rPr>
+                <w:lang w:val="en-US"/>
+              </w:rPr>
+            </w:pPr>
+            <w:r>
+              <w:rPr>
+                <w:lang w:val="en-US"/>
+              </w:rPr>
+              <w:t>16386</w:t>
+            </w:r>
+          </w:p>
+        </w:tc>
+        <w:tc>
+          <w:tcPr>
+            <w:tcW w:w="937" w:type="dxa"/>
+          </w:tcPr>
+          <w:p>
+            <w:pPr>
+              <w:rPr>
+                <w:lang w:val="en-US"/>
+              </w:rPr>
+            </w:pPr>
+            <w:r>
+              <w:rPr>
+                <w:lang w:val="en-US"/>
+              </w:rPr>
+              <w:t>1.640E5</w:t>
+            </w:r>
+          </w:p>
+        </w:tc>
+        <w:tc>
+          <w:tcPr>
+            <w:tcW w:w="903" w:type="dxa"/>
+          </w:tcPr>
+          <w:p>
+            <w:pPr>
+              <w:rPr>
+                <w:lang w:val="en-US"/>
+              </w:rPr>
+            </w:pPr>
+            <w:r>
+              <w:rPr>
+                <w:lang w:val="en-US"/>
+              </w:rPr>
+              <w:t>1638</w:t>
+            </w:r>
+            <w:r>
+              <w:rPr>
+                <w:lang w:val="en-US"/>
+              </w:rPr>
+              <w:t>5</w:t>
+            </w:r>
+          </w:p>
+        </w:tc>
+        <w:tc>
+          <w:tcPr>
+            <w:tcW w:w="1047" w:type="dxa"/>
+          </w:tcPr>
+          <w:p>
+            <w:pPr>
+              <w:rPr>
+                <w:lang w:val="en-US"/>
+              </w:rPr>
+            </w:pPr>
+            <w:r>
+              <w:rPr>
+                <w:lang w:val="en-US"/>
+              </w:rPr>
+              <w:t>loop auto-</w:t>
+            </w:r>
+            <w:proofErr w:type="spellStart"/>
+            <w:r>
+              <w:rPr>
+                <w:lang w:val="en-US"/>
+              </w:rPr>
+              <w:t>rew</w:t>
+            </w:r>
+            <w:proofErr w:type="spellEnd"/>
+          </w:p>
+        </w:tc>
+        <w:tc>
+          <w:tcPr>
+            <w:tcW w:w="791" w:type="dxa"/>
+          </w:tcPr>
+          <w:p>
+            <w:pPr>
+              <w:rPr>
+                <w:lang w:val="en-US"/>
+              </w:rPr>
+            </w:pPr>
+            <w:r>
+              <w:rPr>
+                <w:lang w:val="en-US"/>
+              </w:rPr>
+              <w:t>0</w:t>
+            </w:r>
+          </w:p>
+        </w:tc>
+        <w:tc>
+          <w:tcPr>
+            <w:tcW w:w="610" w:type="dxa"/>
+          </w:tcPr>
+          <w:p>
+            <w:pPr>
+              <w:rPr>
+                <w:lang w:val="en-US"/>
+              </w:rPr>
+            </w:pPr>
+            <w:r>
+              <w:rPr>
+                <w:lang w:val="en-US"/>
+              </w:rPr>
+              <w:t>38</w:t>
+            </w:r>
+          </w:p>
+        </w:tc>
+        <w:tc>
+          <w:tcPr>
+            <w:tcW w:w="695" w:type="dxa"/>
+          </w:tcPr>
+          <w:p>
+            <w:pPr>
+              <w:rPr>
+                <w:lang w:val="en-US"/>
+              </w:rPr>
+            </w:pPr>
+            <w:r>
+              <w:rPr>
+                <w:lang w:val="en-US"/>
+              </w:rPr>
+              <w:t>2892</w:t>
+            </w:r>
+          </w:p>
+        </w:tc>
+        <w:tc>
+          <w:tcPr>
+            <w:tcW w:w="784" w:type="dxa"/>
+          </w:tcPr>
+          <w:p>
+            <w:pPr>
+              <w:rPr>
+                <w:lang w:val="en-US"/>
+              </w:rPr>
+            </w:pPr>
+            <w:r>
+              <w:rPr>
+                <w:lang w:val="en-US"/>
+              </w:rPr>
+              <w:t>2271</w:t>
+            </w:r>
+          </w:p>
+        </w:tc>
+        <w:tc>
+          <w:tcPr>
+            <w:tcW w:w="809" w:type="dxa"/>
+          </w:tcPr>
+          <w:p>
+            <w:pPr>
+              <w:rPr>
+                <w:lang w:val="en-US"/>
+              </w:rPr>
+            </w:pPr>
+            <w:r>
+              <w:rPr>
+                <w:lang w:val="en-US"/>
+              </w:rPr>
+              <w:t>0</w:t>
+            </w:r>
+          </w:p>
+        </w:tc>
+      </w:tr>
+      <w:tr>
+        <w:tc>
+          <w:tcPr>
+            <w:tcW w:w="1637" w:type="dxa"/>
+          </w:tcPr>
+          <w:p>
+            <w:pPr>
+              <w:rPr>
+                <w:lang w:val="en-US"/>
+              </w:rPr>
+            </w:pPr>
+            <w:r>
+              <w:rPr>
+                <w:lang w:val="en-US"/>
+              </w:rPr>
+              <w:t>inner</w:t>
+            </w:r>
+          </w:p>
+        </w:tc>
+        <w:tc>
+          <w:tcPr>
+            <w:tcW w:w="1335" w:type="dxa"/>
+          </w:tcPr>
+          <w:p>
+            <w:pPr>
+              <w:rPr>
+                <w:lang w:val="en-US"/>
+              </w:rPr>
+            </w:pPr>
+            <w:r>
+              <w:rPr>
+                <w:lang w:val="en-US"/>
+              </w:rPr>
+              <w:t>II Violation</w:t>
+            </w:r>
+          </w:p>
+          <w:p>
+            <w:pPr>
+              <w:rPr>
+                <w:lang w:val="en-US"/>
+              </w:rPr>
+            </w:pPr>
+            <w:r>
+              <w:rPr>
+                <w:lang w:val="en-US"/>
+              </w:rPr>
+              <w:t>Memory Dependency</w:t>
+            </w:r>
+          </w:p>
+        </w:tc>
+        <w:tc>
+          <w:tcPr>
+            <w:tcW w:w="908" w:type="dxa"/>
+          </w:tcPr>
+          <w:p>
+            <w:pPr>
+              <w:rPr>
+                <w:lang w:val="en-US"/>
+              </w:rPr>
+            </w:pPr>
+          </w:p>
+          <w:p>
+            <w:pPr>
+              <w:rPr>
+                <w:lang w:val="en-US"/>
+              </w:rPr>
+            </w:pPr>
+            <w:r>
+              <w:rPr>
+                <w:lang w:val="en-US"/>
+              </w:rPr>
+              <w:t>16384</w:t>
+            </w:r>
+          </w:p>
+        </w:tc>
+        <w:tc>
+          <w:tcPr>
+            <w:tcW w:w="937" w:type="dxa"/>
+          </w:tcPr>
+          <w:p>
+            <w:pPr>
+              <w:rPr>
+                <w:lang w:val="en-US"/>
+              </w:rPr>
+            </w:pPr>
+            <w:r>
+              <w:rPr>
+                <w:lang w:val="en-US"/>
+              </w:rPr>
+              <w:t>1.640E5</w:t>
+            </w:r>
+          </w:p>
+        </w:tc>
+        <w:tc>
+          <w:tcPr>
+            <w:tcW w:w="903" w:type="dxa"/>
+          </w:tcPr>
+          <w:p>
+            <w:pPr>
+              <w:rPr>
+                <w:lang w:val="en-US"/>
+              </w:rPr>
+            </w:pPr>
+            <w:r>
+              <w:rPr>
+                <w:lang w:val="en-US"/>
+              </w:rPr>
+              <w:t>16</w:t>
+            </w:r>
+          </w:p>
+        </w:tc>
+        <w:tc>
+          <w:tcPr>
+            <w:tcW w:w="1047" w:type="dxa"/>
+          </w:tcPr>
+          <w:p>
+            <w:pPr>
+              <w:rPr>
+                <w:lang w:val="en-US"/>
+              </w:rPr>
+            </w:pPr>
+            <w:r>
+              <w:rPr>
+                <w:lang w:val="en-US"/>
+              </w:rPr>
+              <w:t>yes</w:t>
+            </w:r>
+          </w:p>
+        </w:tc>
+        <w:tc>
+          <w:tcPr>
+            <w:tcW w:w="791" w:type="dxa"/>
+          </w:tcPr>
+          <w:p>
+            <w:pPr>
+              <w:rPr>
+                <w:lang w:val="en-US"/>
+              </w:rPr>
+            </w:pPr>
+            <w:r>
+              <w:rPr>
+                <w:lang w:val="en-US"/>
+              </w:rPr>
+              <w:t>-</w:t>
+            </w:r>
+          </w:p>
+        </w:tc>
+        <w:tc>
+          <w:tcPr>
+            <w:tcW w:w="610" w:type="dxa"/>
+          </w:tcPr>
+          <w:p>
+            <w:pPr>
+              <w:rPr>
+                <w:lang w:val="en-US"/>
+              </w:rPr>
+            </w:pPr>
+            <w:r>
+              <w:rPr>
+                <w:lang w:val="en-US"/>
+              </w:rPr>
+              <w:t>-</w:t>
+            </w:r>
+          </w:p>
+        </w:tc>
+        <w:tc>
+          <w:tcPr>
+            <w:tcW w:w="695" w:type="dxa"/>
+          </w:tcPr>
+          <w:p>
+            <w:pPr>
+              <w:rPr>
+                <w:lang w:val="en-US"/>
+              </w:rPr>
+            </w:pPr>
+            <w:r>
+              <w:rPr>
+                <w:lang w:val="en-US"/>
+              </w:rPr>
+              <w:t>-</w:t>
+            </w:r>
+          </w:p>
+        </w:tc>
+        <w:tc>
+          <w:tcPr>
+            <w:tcW w:w="784" w:type="dxa"/>
+          </w:tcPr>
+          <w:p>
+            <w:pPr>
+              <w:rPr>
+                <w:lang w:val="en-US"/>
+              </w:rPr>
+            </w:pPr>
+            <w:r>
+              <w:rPr>
+                <w:lang w:val="en-US"/>
+              </w:rPr>
+              <w:t>-</w:t>
+            </w:r>
+          </w:p>
+        </w:tc>
+        <w:tc>
+          <w:tcPr>
+            <w:tcW w:w="809" w:type="dxa"/>
+          </w:tcPr>
+          <w:p>
+            <w:pPr>
+              <w:rPr>
+                <w:lang w:val="en-US"/>
+              </w:rPr>
+            </w:pPr>
+            <w:r>
+              <w:rPr>
+                <w:lang w:val="en-US"/>
+              </w:rPr>
+              <w:t>-</w:t>
+            </w:r>
+          </w:p>
+        </w:tc>
+      </w:tr>
+    </w:tbl>
+    <w:p>
+      <w:pPr>
+        <w:rPr>
+          <w:szCs w:val="20"/>
+          <w:lang w:val="en-US"/>
+        </w:rPr>
+      </w:pPr>
+    </w:p>
+    <w:p>
+      <w:pPr>
+        <w:rPr>
+          <w:lang w:val="en-US"/>
+        </w:rPr>
+      </w:pPr>
+      <w:r>
+        <w:rPr>
+          <w:lang w:val="en-US"/>
+        </w:rPr>
+        <w:t xml:space="preserve">(FLOPs = 5·N·log₂N = </w:t>
+      </w:r>
+      <w:r>
+        <w:rPr>
+          <w:lang w:val="en-US"/>
+        </w:rPr>
+        <w:t xml:space="preserve">= </w:t>
+      </w:r>
+      <w:r>
+        <w:rPr>
+          <w:lang w:val="en-US"/>
+        </w:rPr>
+        <w:t xml:space="preserve">51,200, </w:t>
+      </w:r>
+      <w:proofErr w:type="spellStart"/>
+      <w:r>
+        <w:rPr>
+          <w:lang w:val="en-US"/>
+        </w:rPr>
+        <w:t>F_Fmax</w:t>
+      </w:r>
+      <w:proofErr w:type="spellEnd"/>
+      <w:r>
+        <w:rPr>
+          <w:lang w:val="en-US"/>
+        </w:rPr>
+        <w:t xml:space="preserve"> = 141.08 MHz, </w:t>
+      </w:r>
+      <w:proofErr w:type="spellStart"/>
+      <w:r>
+        <w:rPr>
+          <w:lang w:val="en-US"/>
+        </w:rPr>
+        <w:t>L_cycles</w:t>
+      </w:r>
+      <w:proofErr w:type="spellEnd"/>
+      <w:r>
+        <w:rPr>
+          <w:lang w:val="en-US"/>
+        </w:rPr>
+        <w:t xml:space="preserve"> = 30,891)</w:t>
+      </w:r>
+    </w:p>
+    <w:p>
+      <w:pPr>
+        <w:rPr>
+          <w:rStyle w:val="ab"/>
+          <w:lang w:val="en-US"/>
+        </w:rPr>
+      </w:pPr>
+      <w:r>
+        <w:rPr>
+          <w:lang w:val="en-US"/>
+        </w:rPr>
+        <w:t xml:space="preserve">Throughput = (FLOPs × </w:t>
+      </w:r>
+      <w:proofErr w:type="spellStart"/>
+      <w:r>
+        <w:rPr>
+          <w:lang w:val="en-US"/>
+        </w:rPr>
+        <w:t>F_Fmax</w:t>
+      </w:r>
+      <w:proofErr w:type="spellEnd"/>
+      <w:r>
+        <w:rPr>
+          <w:lang w:val="en-US"/>
+        </w:rPr>
+        <w:t xml:space="preserve">) / </w:t>
+      </w:r>
+      <w:proofErr w:type="spellStart"/>
+      <w:r>
+        <w:rPr>
+          <w:lang w:val="en-US"/>
+        </w:rPr>
+        <w:t>L_cycles</w:t>
+      </w:r>
+      <w:proofErr w:type="spellEnd"/>
+      <w:r>
+        <w:rPr>
+          <w:lang w:val="en-US"/>
+        </w:rPr>
+        <w:t xml:space="preserve"> = (51,200 × 141.08 × 10⁶) / </w:t>
+      </w:r>
+      <w:r>
+        <w:rPr>
+          <w:lang w:val="en-US"/>
+        </w:rPr>
+        <w:t>163881</w:t>
+      </w:r>
+      <w:r>
+        <w:rPr>
+          <w:lang w:val="en-US"/>
+        </w:rPr>
+        <w:t xml:space="preserve"> </w:t>
+      </w:r>
+      <w:r>
+        <w:rPr>
+          <w:lang w:val="en-US"/>
+        </w:rPr>
+        <w:t xml:space="preserve">= </w:t>
+      </w:r>
+      <w:r>
+        <w:rPr>
+          <w:rStyle w:val="ab"/>
+          <w:lang w:val="en-US"/>
+        </w:rPr>
+        <w:t>44.07</w:t>
+      </w:r>
+      <w:r>
+        <w:rPr>
+          <w:rStyle w:val="ab"/>
+          <w:lang w:val="en-US"/>
+        </w:rPr>
+        <w:t xml:space="preserve"> MFLOPS</w:t>
+      </w:r>
+    </w:p>
+    <w:p>
+      <w:pPr>
+        <w:rPr>
+          <w:rStyle w:val="ab"/>
+          <w:lang w:val="en-US"/>
+        </w:rPr>
+      </w:pPr>
+    </w:p>
+    <w:p/>
+    <w:p>
+      <w:pPr>
+        <w:rPr>
+          <w:szCs w:val="20"/>
           <w:lang w:val="en-US"/>
         </w:rPr>
       </w:pPr>
@@ -17939,7 +19326,7 @@
   <w:style w:type="paragraph" w:default="1" w:styleId="a">
     <w:name w:val="Normal"/>
     <w:qFormat/>
-    <w:rsid w:val="004A517E"/>
+    <w:rsid w:val="00245D6F"/>
   </w:style>
   <w:style w:type="paragraph" w:styleId="1">
     <w:name w:val="heading 1"/>
@@ -18476,6 +19863,17 @@
       </w:tblBorders>
     </w:tblPr>
   </w:style>
+  <w:style w:type="character" w:styleId="ab">
+    <w:name w:val="Strong"/>
+    <w:basedOn w:val="a0"/>
+    <w:uiPriority w:val="22"/>
+    <w:qFormat/>
+    <w:rsid w:val="005E3902"/>
+    <w:rPr>
+      <w:b/>
+      <w:bCs/>
+    </w:rPr>
+  </w:style>
 </w:styles>
 </file>
 

</xml_diff>